<commit_message>
Refresh resume/about profile content and UI
- Updated resume assets (`Richard.Hollon.Resume.2027.docx`/`.pdf`).
- Increased About profile image sizes in `layout.css` and `media-queries.css`, and added `object-fit: cover` for improved cropping/display.
- Revised `resumeData.json` profile data:
  - Updated experience description to “over 25 years”.
  - Rewrote bio content.
  - Added `focus: "Backend, Architecture, Azure"`.
  - Simplified employment value to `iA American Financial Group`.
- Updated `About.jsx` to read/render `focus` (with `fa-code` icon), conditionally render phone only when present, and added `focus` to `propTypes`.
</commit_message>
<xml_diff>
--- a/public/content/Richard.Hollon.Resume.2027.docx
+++ b/public/content/Richard.Hollon.Resume.2027.docx
@@ -40,10 +40,10 @@
               <mc:AlternateContent>
                 <mc:Choice Requires="wps">
                   <w:drawing>
-                    <wp:inline distT="0" distB="0" distL="0" distR="0" wp14:anchorId="47C6E04D" wp14:editId="31B478C6">
+                    <wp:inline distT="0" distB="0" distL="0" distR="0" wp14:anchorId="47C6E04D" wp14:editId="7CACC775">
                       <wp:extent cx="2122805" cy="2122805"/>
                       <wp:effectExtent l="19050" t="19050" r="29845" b="29845"/>
-                      <wp:docPr id="2" name="Oval 2">
+                      <wp:docPr id="2" name="Oval 2" descr="Self image of Richard Hollon">
                         <a:hlinkClick xmlns:a="http://schemas.openxmlformats.org/drawingml/2006/main" r:id="rId11"/>
                       </wp:docPr>
                       <wp:cNvGraphicFramePr/>
@@ -107,8 +107,8 @@
                 </mc:Choice>
                 <mc:Fallback>
                   <w:pict>
-                    <v:oval w14:anchorId="233BDDCA" id="Oval 2" o:spid="_x0000_s1026" href="http://www.richardhollon.com/" style="width:167.15pt;height:167.15pt;visibility:visible;mso-wrap-style:square;mso-left-percent:-10001;mso-top-percent:-10001;mso-position-horizontal:absolute;mso-position-horizontal-relative:char;mso-position-vertical:absolute;mso-position-vertical-relative:line;mso-left-percent:-10001;mso-top-percent:-10001;v-text-anchor:middle" o:gfxdata="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" o:button="t" strokecolor="#94b6d2 [3204]" strokeweight="5pt">
-                      <v:fill r:id="rId13" o:title="" recolor="t" rotate="t" o:detectmouseclick="t" type="frame"/>
+                    <v:oval w14:anchorId="4B9DD2F7" id="Oval 2" o:spid="_x0000_s1026" alt="Self image of Richard Hollon" href="http://www.richardhollon.com/" style="width:167.15pt;height:167.15pt;visibility:visible;mso-wrap-style:square;mso-left-percent:-10001;mso-top-percent:-10001;mso-position-horizontal:absolute;mso-position-horizontal-relative:char;mso-position-vertical:absolute;mso-position-vertical-relative:line;mso-left-percent:-10001;mso-top-percent:-10001;v-text-anchor:middle" o:gfxdata="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" o:button="t" strokecolor="#94b6d2 [3204]" strokeweight="5pt">
+                      <v:fill r:id="rId13" o:title="Self image of Richard Hollon" recolor="t" rotate="t" o:detectmouseclick="t" type="frame"/>
                       <v:stroke joinstyle="miter"/>
                       <w10:anchorlock/>
                     </v:oval>
@@ -149,31 +149,38 @@
             </w:pPr>
             <w:r>
               <w:rPr>
-                <w:spacing w:val="0"/>
-                <w:w w:val="100"/>
+                <w:spacing w:val="1"/>
+                <w:w w:val="49"/>
               </w:rPr>
               <w:t>Senior</w:t>
             </w:r>
             <w:r>
               <w:rPr>
-                <w:spacing w:val="0"/>
-                <w:w w:val="100"/>
+                <w:spacing w:val="1"/>
+                <w:w w:val="49"/>
               </w:rPr>
               <w:t xml:space="preserve"> </w:t>
             </w:r>
             <w:r>
               <w:rPr>
-                <w:spacing w:val="0"/>
-                <w:w w:val="100"/>
+                <w:spacing w:val="1"/>
+                <w:w w:val="49"/>
               </w:rPr>
               <w:t>.NET Architect</w:t>
             </w:r>
             <w:r>
               <w:rPr>
-                <w:spacing w:val="0"/>
-                <w:w w:val="100"/>
+                <w:spacing w:val="1"/>
+                <w:w w:val="49"/>
               </w:rPr>
-              <w:t xml:space="preserve"> (Azure)</w:t>
+              <w:t xml:space="preserve"> (Azure</w:t>
+            </w:r>
+            <w:r>
+              <w:rPr>
+                <w:spacing w:val="16"/>
+                <w:w w:val="49"/>
+              </w:rPr>
+              <w:t>)</w:t>
             </w:r>
           </w:p>
         </w:tc>
@@ -186,8 +193,14 @@
           <w:p>
             <w:pPr>
               <w:pStyle w:val="Heading3"/>
+              <w:rPr>
+                <w:color w:val="355D7E" w:themeColor="accent1" w:themeShade="80"/>
+              </w:rPr>
             </w:pPr>
             <w:r>
+              <w:rPr>
+                <w:color w:val="355D7E" w:themeColor="accent1" w:themeShade="80"/>
+              </w:rPr>
               <w:t>OVERVIEW</w:t>
             </w:r>
           </w:p>
@@ -208,6 +221,9 @@
           <w:p/>
           <w:sdt>
             <w:sdtPr>
+              <w:rPr>
+                <w:color w:val="355D7E" w:themeColor="accent1" w:themeShade="80"/>
+              </w:rPr>
               <w:id w:val="-1954003311"/>
               <w:placeholder>
                 <w:docPart w:val="F813FAAA34704158A7E3A81EC7D4EE9B"/>
@@ -220,8 +236,14 @@
               <w:p>
                 <w:pPr>
                   <w:pStyle w:val="Heading3"/>
+                  <w:rPr>
+                    <w:color w:val="355D7E" w:themeColor="accent1" w:themeShade="80"/>
+                  </w:rPr>
                 </w:pPr>
                 <w:r>
+                  <w:rPr>
+                    <w:color w:val="355D7E" w:themeColor="accent1" w:themeShade="80"/>
+                  </w:rPr>
                   <w:t>Contact</w:t>
                 </w:r>
               </w:p>
@@ -310,10 +332,10 @@
                 <w:noProof/>
               </w:rPr>
               <w:drawing>
-                <wp:inline distT="0" distB="0" distL="0" distR="0" wp14:anchorId="09587ACB" wp14:editId="2E678608">
+                <wp:inline distT="0" distB="0" distL="0" distR="0" wp14:anchorId="09587ACB" wp14:editId="3A3D3051">
                   <wp:extent cx="190500" cy="253981"/>
                   <wp:effectExtent l="0" t="0" r="0" b="0"/>
-                  <wp:docPr id="4" name="Graphic 4">
+                  <wp:docPr id="4" name="Graphic 4" descr="Stackoverflow icon">
                     <a:hlinkClick xmlns:a="http://schemas.openxmlformats.org/drawingml/2006/main" r:id="rId16"/>
                   </wp:docPr>
                   <wp:cNvGraphicFramePr>
@@ -323,7 +345,7 @@
                     <a:graphicData uri="http://schemas.openxmlformats.org/drawingml/2006/picture">
                       <pic:pic xmlns:pic="http://schemas.openxmlformats.org/drawingml/2006/picture">
                         <pic:nvPicPr>
-                          <pic:cNvPr id="4" name="Graphic 4">
+                          <pic:cNvPr id="4" name="Graphic 4" descr="Stackoverflow icon">
                             <a:hlinkClick r:id="rId16"/>
                           </pic:cNvPr>
                           <pic:cNvPicPr/>
@@ -369,10 +391,10 @@
                 <w:noProof/>
               </w:rPr>
               <w:drawing>
-                <wp:inline distT="0" distB="0" distL="0" distR="0" wp14:anchorId="2E4A0BCA" wp14:editId="6507B7D1">
+                <wp:inline distT="0" distB="0" distL="0" distR="0" wp14:anchorId="2E4A0BCA" wp14:editId="3FF1BF0E">
                   <wp:extent cx="225053" cy="257175"/>
                   <wp:effectExtent l="0" t="0" r="3810" b="0"/>
-                  <wp:docPr id="1" name="Graphic 1">
+                  <wp:docPr id="1" name="Graphic 1" descr="LinkedIn icon">
                     <a:hlinkClick xmlns:a="http://schemas.openxmlformats.org/drawingml/2006/main" r:id="rId19"/>
                   </wp:docPr>
                   <wp:cNvGraphicFramePr>
@@ -382,7 +404,7 @@
                     <a:graphicData uri="http://schemas.openxmlformats.org/drawingml/2006/picture">
                       <pic:pic xmlns:pic="http://schemas.openxmlformats.org/drawingml/2006/picture">
                         <pic:nvPicPr>
-                          <pic:cNvPr id="1" name="Graphic 1">
+                          <pic:cNvPr id="1" name="Graphic 1" descr="LinkedIn icon">
                             <a:hlinkClick r:id="rId19"/>
                           </pic:cNvPr>
                           <pic:cNvPicPr/>
@@ -425,10 +447,10 @@
                 <w:noProof/>
               </w:rPr>
               <w:drawing>
-                <wp:inline distT="0" distB="0" distL="0" distR="0" wp14:anchorId="69972B8A" wp14:editId="625F8469">
+                <wp:inline distT="0" distB="0" distL="0" distR="0" wp14:anchorId="69972B8A" wp14:editId="27B12531">
                   <wp:extent cx="209550" cy="239459"/>
                   <wp:effectExtent l="0" t="0" r="0" b="8255"/>
-                  <wp:docPr id="5" name="Graphic 5">
+                  <wp:docPr id="5" name="Graphic 5" descr="Instagram icon">
                     <a:hlinkClick xmlns:a="http://schemas.openxmlformats.org/drawingml/2006/main" r:id="rId22"/>
                   </wp:docPr>
                   <wp:cNvGraphicFramePr>
@@ -438,7 +460,7 @@
                     <a:graphicData uri="http://schemas.openxmlformats.org/drawingml/2006/picture">
                       <pic:pic xmlns:pic="http://schemas.openxmlformats.org/drawingml/2006/picture">
                         <pic:nvPicPr>
-                          <pic:cNvPr id="5" name="Graphic 5">
+                          <pic:cNvPr id="5" name="Graphic 5" descr="Instagram icon">
                             <a:hlinkClick r:id="rId22"/>
                           </pic:cNvPr>
                           <pic:cNvPicPr/>
@@ -481,10 +503,10 @@
                 <w:noProof/>
               </w:rPr>
               <w:drawing>
-                <wp:inline distT="0" distB="0" distL="0" distR="0" wp14:anchorId="4ED2A8E6" wp14:editId="29004D3D">
+                <wp:inline distT="0" distB="0" distL="0" distR="0" wp14:anchorId="4ED2A8E6" wp14:editId="01EBE978">
                   <wp:extent cx="233739" cy="241300"/>
                   <wp:effectExtent l="0" t="0" r="0" b="6350"/>
-                  <wp:docPr id="6" name="Graphic 6">
+                  <wp:docPr id="6" name="Graphic 6" descr="GitHub icon">
                     <a:hlinkClick xmlns:a="http://schemas.openxmlformats.org/drawingml/2006/main" r:id="rId25"/>
                   </wp:docPr>
                   <wp:cNvGraphicFramePr>
@@ -494,7 +516,7 @@
                     <a:graphicData uri="http://schemas.openxmlformats.org/drawingml/2006/picture">
                       <pic:pic xmlns:pic="http://schemas.openxmlformats.org/drawingml/2006/picture">
                         <pic:nvPicPr>
-                          <pic:cNvPr id="6" name="Graphic 6">
+                          <pic:cNvPr id="6" name="Graphic 6" descr="GitHub icon">
                             <a:hlinkClick r:id="rId25"/>
                           </pic:cNvPr>
                           <pic:cNvPicPr/>
@@ -534,8 +556,14 @@
           <w:p>
             <w:pPr>
               <w:pStyle w:val="Heading3"/>
+              <w:rPr>
+                <w:color w:val="355D7E" w:themeColor="accent1" w:themeShade="80"/>
+              </w:rPr>
             </w:pPr>
             <w:r>
+              <w:rPr>
+                <w:color w:val="355D7E" w:themeColor="accent1" w:themeShade="80"/>
+              </w:rPr>
               <w:t>Certifications</w:t>
             </w:r>
           </w:p>
@@ -654,7 +682,10 @@
               </w:rPr>
             </w:pPr>
             <w:r>
-              <w:t>Innovative Aftermarket Systems</w:t>
+              <w:t>iA American Financial</w:t>
+            </w:r>
+            <w:r>
+              <w:t xml:space="preserve"> Group</w:t>
             </w:r>
             <w:r>
               <w:t xml:space="preserve"> </w:t>
@@ -672,7 +703,13 @@
               <w:t>enior</w:t>
             </w:r>
             <w:r>
-              <w:t xml:space="preserve"> Full Stack Developer</w:t>
+              <w:t xml:space="preserve"> </w:t>
+            </w:r>
+            <w:r>
+              <w:t>.NET Architect</w:t>
+            </w:r>
+            <w:r>
+              <w:t xml:space="preserve"> (Azure)</w:t>
             </w:r>
           </w:p>
           <w:p>
@@ -726,9 +763,11 @@
                 <w:bCs/>
               </w:rPr>
             </w:pPr>
+            <w:proofErr w:type="spellStart"/>
             <w:r>
               <w:t>XCentium</w:t>
             </w:r>
+            <w:proofErr w:type="spellEnd"/>
             <w:r>
               <w:t xml:space="preserve"> </w:t>
             </w:r>
@@ -813,8 +852,13 @@
           </w:p>
           <w:p>
             <w:r>
-              <w:t>Lead ASP.NET MVC developer for Labor Market and Career Information department at the Texas State capitol</w:t>
-            </w:r>
+              <w:t xml:space="preserve">Lead ASP.NET MVC developer for Labor Market and Career Information department at the Texas State </w:t>
+            </w:r>
+            <w:proofErr w:type="gramStart"/>
+            <w:r>
+              <w:t>capitol</w:t>
+            </w:r>
+            <w:proofErr w:type="gramEnd"/>
             <w:r>
               <w:t xml:space="preserve"> </w:t>
             </w:r>
@@ -905,13 +949,34 @@
         </w:rPr>
       </w:pPr>
       <w:r>
-        <w:t>Innovative Aftermarket Systems –</w:t>
+        <w:t>iA American Financial</w:t>
+      </w:r>
+      <w:r>
+        <w:t xml:space="preserve"> Group</w:t>
+      </w:r>
+      <w:r>
+        <w:t xml:space="preserve"> –</w:t>
       </w:r>
       <w:r>
         <w:t xml:space="preserve"> </w:t>
       </w:r>
       <w:r>
-        <w:t xml:space="preserve">Senior Full Stack Developer – Austin, Texas </w:t>
+        <w:t xml:space="preserve">Senior </w:t>
+      </w:r>
+      <w:r>
+        <w:t>.NET Architect (Azure)</w:t>
+      </w:r>
+      <w:r>
+        <w:t xml:space="preserve"> – </w:t>
+      </w:r>
+      <w:r>
+        <w:t xml:space="preserve">Remote / </w:t>
+      </w:r>
+      <w:r>
+        <w:t xml:space="preserve">Austin, Texas </w:t>
+      </w:r>
+      <w:r>
+        <w:t>/ Quebec, Canada</w:t>
       </w:r>
     </w:p>
     <w:p>
@@ -968,9 +1033,11 @@
           <w:bCs/>
         </w:rPr>
       </w:pPr>
+      <w:proofErr w:type="spellStart"/>
       <w:r>
         <w:t>XCentium</w:t>
       </w:r>
+      <w:proofErr w:type="spellEnd"/>
       <w:r>
         <w:t xml:space="preserve"> </w:t>
       </w:r>
@@ -1037,8 +1104,13 @@
     </w:p>
     <w:p>
       <w:r>
-        <w:t>Lead ASP.NET MVC developer for Labor Market and Career Information department at the Texas State capitol</w:t>
-      </w:r>
+        <w:t xml:space="preserve">Lead ASP.NET MVC developer for Labor Market and Career Information department at the Texas State </w:t>
+      </w:r>
+      <w:proofErr w:type="gramStart"/>
+      <w:r>
+        <w:t>capitol</w:t>
+      </w:r>
+      <w:proofErr w:type="gramEnd"/>
       <w:r>
         <w:t xml:space="preserve"> </w:t>
       </w:r>
@@ -1071,8 +1143,13 @@
     </w:p>
     <w:p>
       <w:r>
-        <w:t>Lead ASP.NET MVC developer for Labor Market and Career Information department at the Texas State capitol</w:t>
-      </w:r>
+        <w:t xml:space="preserve">Lead ASP.NET MVC developer for Labor Market and Career Information department at the Texas State </w:t>
+      </w:r>
+      <w:proofErr w:type="gramStart"/>
+      <w:r>
+        <w:t>capitol</w:t>
+      </w:r>
+      <w:proofErr w:type="gramEnd"/>
       <w:r>
         <w:t xml:space="preserve"> </w:t>
       </w:r>
@@ -1147,8 +1224,13 @@
           <w:bCs/>
         </w:rPr>
       </w:pPr>
-      <w:r>
-        <w:t>Incenergy – Full Stack Software Developer – Austin, Texas</w:t>
+      <w:proofErr w:type="spellStart"/>
+      <w:r>
+        <w:t>Incenergy</w:t>
+      </w:r>
+      <w:proofErr w:type="spellEnd"/>
+      <w:r>
+        <w:t xml:space="preserve"> – Full Stack Software Developer – Austin, Texas</w:t>
       </w:r>
     </w:p>
     <w:p>
@@ -1271,8 +1353,13 @@
           <w:bCs/>
         </w:rPr>
       </w:pPr>
-      <w:r>
-        <w:t>HomeCity Inc. – Mid-level .NET Web Developer – Westlake, Texas</w:t>
+      <w:proofErr w:type="spellStart"/>
+      <w:r>
+        <w:t>HomeCity</w:t>
+      </w:r>
+      <w:proofErr w:type="spellEnd"/>
+      <w:r>
+        <w:t xml:space="preserve"> Inc. – Mid-level .NET Web Developer – Westlake, Texas</w:t>
       </w:r>
     </w:p>
     <w:p>
@@ -2178,6 +2265,7 @@
   <w:style w:type="character" w:default="1" w:styleId="DefaultParagraphFont">
     <w:name w:val="Default Paragraph Font"/>
     <w:uiPriority w:val="1"/>
+    <w:semiHidden/>
     <w:unhideWhenUsed/>
   </w:style>
   <w:style w:type="table" w:default="1" w:styleId="TableNormal">
@@ -3594,8 +3682,10 @@
   </w:compat>
   <w:rsids>
     <w:rsidRoot w:val="001D5C5F"/>
+    <w:rsid w:val="00111ACC"/>
     <w:rsid w:val="001D5C5F"/>
     <w:rsid w:val="004E5C11"/>
+    <w:rsid w:val="00584DCA"/>
     <w:rsid w:val="005C2A56"/>
     <w:rsid w:val="00827739"/>
     <w:rsid w:val="00896186"/>
@@ -4598,12 +4688,7 @@
 </file>
 
 <file path=customXml/item2.xml><?xml version="1.0" encoding="utf-8"?>
-<?mso-contentType ?>
-<FormTemplates xmlns="http://schemas.microsoft.com/sharepoint/v3/contenttype/forms">
-  <Display>DocumentLibraryForm</Display>
-  <Edit>DocumentLibraryForm</Edit>
-  <New>DocumentLibraryForm</New>
-</FormTemplates>
+<b:Sources xmlns:b="http://schemas.openxmlformats.org/officeDocument/2006/bibliography" xmlns="http://schemas.openxmlformats.org/officeDocument/2006/bibliography" SelectedStyle="\APASixthEditionOfficeOnline.xsl" StyleName="APA" Version="6"/>
 </file>
 
 <file path=customXml/item3.xml><?xml version="1.0" encoding="utf-8"?>
@@ -4615,7 +4700,12 @@
 </file>
 
 <file path=customXml/item4.xml><?xml version="1.0" encoding="utf-8"?>
-<b:Sources xmlns:b="http://schemas.openxmlformats.org/officeDocument/2006/bibliography" xmlns="http://schemas.openxmlformats.org/officeDocument/2006/bibliography" SelectedStyle="\APASixthEditionOfficeOnline.xsl" StyleName="APA" Version="6"/>
+<?mso-contentType ?>
+<FormTemplates xmlns="http://schemas.microsoft.com/sharepoint/v3/contenttype/forms">
+  <Display>DocumentLibraryForm</Display>
+  <Edit>DocumentLibraryForm</Edit>
+  <New>DocumentLibraryForm</New>
+</FormTemplates>
 </file>
 
 <file path=customXml/itemProps1.xml><?xml version="1.0" encoding="utf-8"?>
@@ -4638,9 +4728,9 @@
 </file>
 
 <file path=customXml/itemProps2.xml><?xml version="1.0" encoding="utf-8"?>
-<ds:datastoreItem xmlns:ds="http://schemas.openxmlformats.org/officeDocument/2006/customXml" ds:itemID="{18506A0D-4821-47C2-BD9B-CACF27C6B108}">
+<ds:datastoreItem xmlns:ds="http://schemas.openxmlformats.org/officeDocument/2006/customXml" ds:itemID="{18B78886-F567-4C49-A8D0-A5FAE86EFC99}">
   <ds:schemaRefs>
-    <ds:schemaRef ds:uri="http://schemas.microsoft.com/sharepoint/v3/contenttype/forms"/>
+    <ds:schemaRef ds:uri="http://schemas.openxmlformats.org/officeDocument/2006/bibliography"/>
   </ds:schemaRefs>
 </ds:datastoreItem>
 </file>
@@ -4656,9 +4746,9 @@
 </file>
 
 <file path=customXml/itemProps4.xml><?xml version="1.0" encoding="utf-8"?>
-<ds:datastoreItem xmlns:ds="http://schemas.openxmlformats.org/officeDocument/2006/customXml" ds:itemID="{18B78886-F567-4C49-A8D0-A5FAE86EFC99}">
+<ds:datastoreItem xmlns:ds="http://schemas.openxmlformats.org/officeDocument/2006/customXml" ds:itemID="{18506A0D-4821-47C2-BD9B-CACF27C6B108}">
   <ds:schemaRefs>
-    <ds:schemaRef ds:uri="http://schemas.openxmlformats.org/officeDocument/2006/bibliography"/>
+    <ds:schemaRef ds:uri="http://schemas.microsoft.com/sharepoint/v3/contenttype/forms"/>
   </ds:schemaRefs>
 </ds:datastoreItem>
 </file>
</xml_diff>